<commit_message>
Cambios semánticos y de estilos
</commit_message>
<xml_diff>
--- a/persistence/src/main/resources/plantillas/Justificante.docx
+++ b/persistence/src/main/resources/plantillas/Justificante.docx
@@ -1,17 +1,19 @@
 
 <file path=word/document.xml><?xml version="1.0" encoding="utf-8"?>
-<w:document xmlns:o="urn:schemas-microsoft-com:office:office" xmlns:r="http://schemas.openxmlformats.org/officeDocument/2006/relationships" xmlns:v="urn:schemas-microsoft-com:vml" xmlns:w="http://schemas.openxmlformats.org/wordprocessingml/2006/main" xmlns:w10="urn:schemas-microsoft-com:office:word" xmlns:wp="http://schemas.openxmlformats.org/drawingml/2006/wordprocessingDrawing" xmlns:wps="http://schemas.microsoft.com/office/word/2010/wordprocessingShape" xmlns:wpg="http://schemas.microsoft.com/office/word/2010/wordprocessingGroup" xmlns:mc="http://schemas.openxmlformats.org/markup-compatibility/2006" xmlns:wp14="http://schemas.microsoft.com/office/word/2010/wordprocessingDrawing" xmlns:w14="http://schemas.microsoft.com/office/word/2010/wordml" xmlns:w15="http://schemas.microsoft.com/office/word/2012/wordml" mc:Ignorable="w14 wp14 w15">
+<w:document xmlns:wpc="http://schemas.microsoft.com/office/word/2010/wordprocessingCanvas" xmlns:mc="http://schemas.openxmlformats.org/markup-compatibility/2006" xmlns:o="urn:schemas-microsoft-com:office:office" xmlns:r="http://schemas.openxmlformats.org/officeDocument/2006/relationships" xmlns:m="http://schemas.openxmlformats.org/officeDocument/2006/math" xmlns:v="urn:schemas-microsoft-com:vml" xmlns:wp14="http://schemas.microsoft.com/office/word/2010/wordprocessingDrawing" xmlns:wp="http://schemas.openxmlformats.org/drawingml/2006/wordprocessingDrawing" xmlns:w10="urn:schemas-microsoft-com:office:word" xmlns:w="http://schemas.openxmlformats.org/wordprocessingml/2006/main" xmlns:w14="http://schemas.microsoft.com/office/word/2010/wordml" xmlns:wpg="http://schemas.microsoft.com/office/word/2010/wordprocessingGroup" xmlns:wpi="http://schemas.microsoft.com/office/word/2010/wordprocessingInk" xmlns:wne="http://schemas.microsoft.com/office/word/2006/wordml" xmlns:wps="http://schemas.microsoft.com/office/word/2010/wordprocessingShape" mc:Ignorable="w14 wp14">
   <w:body>
     <w:p>
       <w:pPr>
-        <w:pStyle w:val="Cuerpodetexto"/>
+        <w:pStyle w:val="Textoindependiente"/>
         <w:jc w:val="both"/>
-        <w:rPr/>
-      </w:pPr>
-      <w:r>
-        <w:rPr/>
+      </w:pPr>
+      <w:r>
+        <w:rPr>
+          <w:noProof/>
+          <w:lang w:eastAsia="es-ES"/>
+        </w:rPr>
         <w:drawing>
-          <wp:anchor behindDoc="1" distT="0" distB="0" distL="0" distR="0" simplePos="0" locked="0" layoutInCell="0" allowOverlap="1" relativeHeight="2">
+          <wp:anchor distT="0" distB="0" distL="0" distR="0" simplePos="0" relativeHeight="2" behindDoc="1" locked="0" layoutInCell="0" allowOverlap="1">
             <wp:simplePos x="0" y="0"/>
             <wp:positionH relativeFrom="column">
               <wp:posOffset>0</wp:posOffset>
@@ -22,7 +24,7 @@
             <wp:extent cx="5400040" cy="614680"/>
             <wp:effectExtent l="0" t="0" r="0" b="0"/>
             <wp:wrapSquare wrapText="largest"/>
-            <wp:docPr id="1" name="Imagen1" descr=""/>
+            <wp:docPr id="1" name="Imagen1"/>
             <wp:cNvGraphicFramePr>
               <a:graphicFrameLocks xmlns:a="http://schemas.openxmlformats.org/drawingml/2006/main" noChangeAspect="1"/>
             </wp:cNvGraphicFramePr>
@@ -30,13 +32,13 @@
               <a:graphicData uri="http://schemas.openxmlformats.org/drawingml/2006/picture">
                 <pic:pic xmlns:pic="http://schemas.openxmlformats.org/drawingml/2006/picture">
                   <pic:nvPicPr>
-                    <pic:cNvPr id="1" name="Imagen1" descr=""/>
+                    <pic:cNvPr id="1" name="Imagen1"/>
                     <pic:cNvPicPr>
                       <a:picLocks noChangeAspect="1" noChangeArrowheads="1"/>
                     </pic:cNvPicPr>
                   </pic:nvPicPr>
                   <pic:blipFill>
-                    <a:blip r:embed="rId2"/>
+                    <a:blip r:embed="rId8"/>
                     <a:stretch>
                       <a:fillRect/>
                     </a:stretch>
@@ -59,129 +61,127 @@
     </w:p>
     <w:p>
       <w:pPr>
-        <w:pStyle w:val="Cuerpodetexto"/>
+        <w:pStyle w:val="Textoindependiente"/>
         <w:jc w:val="both"/>
-        <w:rPr/>
-      </w:pPr>
-      <w:r>
-        <w:rPr/>
+      </w:pPr>
+      <w:r>
         <w:t>$saludo</w:t>
       </w:r>
     </w:p>
     <w:p>
       <w:pPr>
-        <w:pStyle w:val="Cuerpodetexto"/>
+        <w:pStyle w:val="Textoindependiente"/>
         <w:jc w:val="both"/>
-        <w:rPr/>
-      </w:pPr>
-      <w:r>
-        <w:rPr/>
+      </w:pPr>
+      <w:r>
         <w:t>Le informamos que su registro electrónico ha sido presentado correctamente a través de nuestra sede electrónica.</w:t>
       </w:r>
     </w:p>
     <w:p>
       <w:pPr>
-        <w:pStyle w:val="Cuerpodetexto"/>
+        <w:pStyle w:val="Textoindependiente"/>
         <w:jc w:val="both"/>
-        <w:rPr/>
-      </w:pPr>
-      <w:r>
-        <w:rPr/>
+      </w:pPr>
+      <w:r>
         <w:t>A continuación, le facilitamos los datos principales del registro realizado:</w:t>
       </w:r>
     </w:p>
     <w:p>
       <w:pPr>
-        <w:pStyle w:val="Cuerpodetexto"/>
+        <w:pStyle w:val="Textoindependiente"/>
         <w:numPr>
           <w:ilvl w:val="0"/>
           <w:numId w:val="1"/>
         </w:numPr>
         <w:tabs>
-          <w:tab w:val="clear" w:pos="708"/>
-          <w:tab w:val="left" w:pos="0" w:leader="none"/>
-        </w:tabs>
-        <w:ind w:left="709" w:hanging="283"/>
+          <w:tab w:val="clear" w:pos="709"/>
+          <w:tab w:val="left" w:pos="0"/>
+        </w:tabs>
         <w:jc w:val="both"/>
-        <w:rPr/>
       </w:pPr>
       <w:r>
         <w:rPr>
           <w:rStyle w:val="Destaquemayor"/>
-          <w:b/>
-          <w:bCs/>
         </w:rPr>
         <w:t>Oficina de registro:</w:t>
       </w:r>
       <w:r>
-        <w:rPr/>
-        <w:t xml:space="preserve"> $oficinaRegistro</w:t>
-      </w:r>
-    </w:p>
-    <w:p>
-      <w:pPr>
-        <w:pStyle w:val="Cuerpodetexto"/>
+        <w:t xml:space="preserve"> $</w:t>
+      </w:r>
+      <w:proofErr w:type="spellStart"/>
+      <w:r>
+        <w:t>oficinaRegistro</w:t>
+      </w:r>
+      <w:proofErr w:type="spellEnd"/>
+    </w:p>
+    <w:p>
+      <w:pPr>
+        <w:pStyle w:val="Textoindependiente"/>
         <w:numPr>
           <w:ilvl w:val="0"/>
           <w:numId w:val="1"/>
         </w:numPr>
         <w:tabs>
-          <w:tab w:val="clear" w:pos="708"/>
-          <w:tab w:val="left" w:pos="0" w:leader="none"/>
-        </w:tabs>
-        <w:ind w:left="709" w:hanging="283"/>
+          <w:tab w:val="clear" w:pos="709"/>
+          <w:tab w:val="left" w:pos="0"/>
+        </w:tabs>
         <w:jc w:val="both"/>
-        <w:rPr/>
       </w:pPr>
       <w:r>
         <w:rPr>
           <w:rStyle w:val="Destaquemayor"/>
-          <w:b/>
-          <w:bCs/>
         </w:rPr>
-        <w:t>Fecha y hora de presentación:</w:t>
-      </w:r>
-      <w:r>
-        <w:rPr/>
-        <w:t xml:space="preserve"> $fechaRegistro</w:t>
-      </w:r>
-    </w:p>
-    <w:p>
-      <w:pPr>
-        <w:pStyle w:val="Cuerpodetexto"/>
+        <w:t xml:space="preserve">Fecha y hora de </w:t>
+      </w:r>
+      <w:r>
+        <w:rPr>
+          <w:rStyle w:val="Destaquemayor"/>
+        </w:rPr>
+        <w:t>presentación:</w:t>
+      </w:r>
+      <w:r>
+        <w:t xml:space="preserve"> $</w:t>
+      </w:r>
+      <w:proofErr w:type="spellStart"/>
+      <w:r>
+        <w:t>fechaRegistro</w:t>
+      </w:r>
+      <w:proofErr w:type="spellEnd"/>
+    </w:p>
+    <w:p>
+      <w:pPr>
+        <w:pStyle w:val="Textoindependiente"/>
         <w:numPr>
           <w:ilvl w:val="0"/>
           <w:numId w:val="1"/>
         </w:numPr>
         <w:tabs>
-          <w:tab w:val="clear" w:pos="708"/>
-          <w:tab w:val="left" w:pos="0" w:leader="none"/>
-        </w:tabs>
-        <w:ind w:left="709" w:hanging="283"/>
+          <w:tab w:val="clear" w:pos="709"/>
+          <w:tab w:val="left" w:pos="0"/>
+        </w:tabs>
         <w:jc w:val="both"/>
-        <w:rPr/>
       </w:pPr>
       <w:r>
         <w:rPr>
           <w:rStyle w:val="Destaquemayor"/>
-          <w:b/>
-          <w:bCs/>
         </w:rPr>
         <w:t>Número de registro:</w:t>
       </w:r>
       <w:r>
-        <w:rPr/>
-        <w:t xml:space="preserve"> $numeroRegistro</w:t>
-      </w:r>
-    </w:p>
-    <w:p>
-      <w:pPr>
-        <w:pStyle w:val="Cuerpodetexto"/>
+        <w:t xml:space="preserve"> $</w:t>
+      </w:r>
+      <w:proofErr w:type="spellStart"/>
+      <w:r>
+        <w:t>numeroRegistro</w:t>
+      </w:r>
+      <w:proofErr w:type="spellEnd"/>
+    </w:p>
+    <w:p>
+      <w:pPr>
+        <w:pStyle w:val="Textoindependiente"/>
         <w:jc w:val="both"/>
-        <w:rPr/>
-      </w:pPr>
-      <w:r>
-        <w:rPr/>
+      </w:pPr>
+      <w:r>
         <w:t>Adjunto a este correo encontrará el</w:t>
       </w:r>
       <w:r>
@@ -194,39 +194,40 @@
       <w:r>
         <w:rPr>
           <w:rStyle w:val="Destaquemayor"/>
-          <w:b/>
-          <w:bCs/>
         </w:rPr>
         <w:t>justificante de presentación en formato PDF</w:t>
       </w:r>
       <w:r>
-        <w:rPr/>
         <w:t>, que acredita la correcta recepción de su solicitud.</w:t>
       </w:r>
     </w:p>
     <w:p>
       <w:pPr>
-        <w:pStyle w:val="Cuerpodetexto"/>
+        <w:pStyle w:val="Textoindependiente"/>
         <w:jc w:val="both"/>
-        <w:rPr/>
-      </w:pPr>
-      <w:r>
-        <w:rPr/>
-        <w:t>En caso de que haya omitido adjuntar alguna documentación durante el proceso de registro, le ofrecemos la posibilidad de completar su expediente a través del siguiente enlace:</w:t>
-      </w:r>
-    </w:p>
-    <w:p>
-      <w:pPr>
-        <w:pStyle w:val="Cuerpodetexto"/>
+      </w:pPr>
+      <w:r>
+        <w:t xml:space="preserve">En caso de que haya omitido adjuntar alguna documentación </w:t>
+      </w:r>
+      <w:r>
+        <w:t>durante el proceso de registro, le ofrecemos la posibilidad de completar su expediente a través del siguiente enlace:</w:t>
+      </w:r>
+    </w:p>
+    <w:p>
+      <w:pPr>
+        <w:pStyle w:val="Textoindependiente"/>
         <w:jc w:val="both"/>
-        <w:rPr/>
-      </w:pPr>
-      <w:hyperlink r:id="rId3">
+        <w:rPr>
+          <w:color w:val="005EB5"/>
+        </w:rPr>
+      </w:pPr>
+      <w:hyperlink r:id="rId9">
         <w:r>
           <w:rPr>
             <w:rStyle w:val="EnlacedeInternet"/>
             <w:b/>
             <w:bCs/>
+            <w:color w:val="005EB5"/>
           </w:rPr>
           <w:t>Acceder al trámite para aportar documentación adicional</w:t>
         </w:r>
@@ -234,99 +235,158 @@
     </w:p>
     <w:p>
       <w:pPr>
-        <w:pStyle w:val="Cuerpodetexto"/>
+        <w:pStyle w:val="Textoindependiente"/>
         <w:jc w:val="both"/>
-        <w:rPr/>
-      </w:pPr>
-      <w:r>
-        <w:rPr/>
-        <w:t>Para cualquier consulta o aclaración, puede ponerse en contacto con nuestra oficina a través de los canales habituales de atención al ciudadano.</w:t>
-      </w:r>
-    </w:p>
-    <w:p>
-      <w:pPr>
-        <w:pStyle w:val="Cuerpodetexto"/>
+      </w:pPr>
+      <w:r>
+        <w:t>Para cualquier consulta o aclaración, puede po</w:t>
+      </w:r>
+      <w:r>
+        <w:t>nerse en contacto con nuestra ofici</w:t>
+      </w:r>
+      <w:bookmarkStart w:id="0" w:name="_GoBack"/>
+      <w:bookmarkEnd w:id="0"/>
+      <w:r>
+        <w:t>na a través de los canales habituales de atención al ciudadano.</w:t>
+      </w:r>
+    </w:p>
+    <w:p>
+      <w:pPr>
+        <w:pStyle w:val="Textoindependiente"/>
         <w:jc w:val="both"/>
-        <w:rPr/>
-      </w:pPr>
-      <w:r>
-        <w:rPr/>
+      </w:pPr>
+      <w:r>
         <w:t>Atentamente,</w:t>
       </w:r>
     </w:p>
     <w:p>
       <w:pPr>
-        <w:pStyle w:val="Cuerpodetexto"/>
-        <w:spacing w:lineRule="auto" w:line="276" w:before="0" w:after="140"/>
-        <w:jc w:val="left"/>
-        <w:rPr/>
-      </w:pPr>
-      <w:r>
-        <w:rPr/>
+        <w:pStyle w:val="Textoindependiente"/>
+      </w:pPr>
+      <w:r>
         <w:br/>
       </w:r>
       <w:r>
         <w:rPr>
           <w:rStyle w:val="Destaquemayor"/>
-          <w:b/>
-          <w:bCs/>
         </w:rPr>
-        <w:t>Autoridad Portuaria de las Islas Baleares</w:t>
-      </w:r>
-    </w:p>
-    <w:p>
-      <w:pPr>
-        <w:pStyle w:val="Cuerpodetexto"/>
-        <w:spacing w:lineRule="auto" w:line="276" w:before="0" w:after="140"/>
-        <w:jc w:val="left"/>
-        <w:rPr/>
-      </w:pPr>
-      <w:r>
-        <w:rPr/>
-        <w:t xml:space="preserve">Moll Vell 3-5 Palma 07012 Tel: 971228150 E-mail: </w:t>
-      </w:r>
-      <w:hyperlink r:id="rId4">
+        <w:t xml:space="preserve">Autoridad Portuaria de </w:t>
+      </w:r>
+      <w:r>
+        <w:rPr>
+          <w:rStyle w:val="Destaquemayor"/>
+        </w:rPr>
+        <w:t>Baleares</w:t>
+      </w:r>
+    </w:p>
+    <w:p>
+      <w:pPr>
+        <w:pStyle w:val="Textoindependiente"/>
+      </w:pPr>
+      <w:proofErr w:type="spellStart"/>
+      <w:r>
+        <w:t>Moll</w:t>
+      </w:r>
+      <w:proofErr w:type="spellEnd"/>
+      <w:r>
+        <w:t xml:space="preserve"> </w:t>
+      </w:r>
+      <w:proofErr w:type="spellStart"/>
+      <w:r>
+        <w:t>Vell</w:t>
+      </w:r>
+      <w:proofErr w:type="spellEnd"/>
+      <w:r>
+        <w:t xml:space="preserve"> 3-5 Palma 07012 Tel: 971228150 E-mail: </w:t>
+      </w:r>
+      <w:hyperlink r:id="rId10">
         <w:r>
           <w:rPr>
             <w:rStyle w:val="EnlacedeInternet"/>
+            <w:color w:val="005EB5"/>
           </w:rPr>
           <w:t>portsdebalears@portsdebalears.com</w:t>
         </w:r>
       </w:hyperlink>
     </w:p>
     <w:sectPr>
-      <w:headerReference w:type="default" r:id="rId5"/>
-      <w:type w:val="nextPage"/>
+      <w:headerReference w:type="default" r:id="rId11"/>
       <w:pgSz w:w="11906" w:h="16838"/>
-      <w:pgMar w:left="1701" w:right="1701" w:gutter="0" w:header="1417" w:top="2193" w:footer="0" w:bottom="1417"/>
-      <w:pgNumType w:fmt="decimal"/>
-      <w:formProt w:val="false"/>
-      <w:textDirection w:val="lrTb"/>
-      <w:docGrid w:type="default" w:linePitch="360" w:charSpace="4096"/>
+      <w:pgMar w:top="2193" w:right="1701" w:bottom="1417" w:left="1701" w:header="1417" w:footer="0" w:gutter="0"/>
+      <w:cols w:space="720"/>
+      <w:formProt w:val="0"/>
+      <w:docGrid w:linePitch="360" w:charSpace="4096"/>
     </w:sectPr>
   </w:body>
 </w:document>
 </file>
 
+<file path=word/endnotes.xml><?xml version="1.0" encoding="utf-8"?>
+<w:endnotes xmlns:wpc="http://schemas.microsoft.com/office/word/2010/wordprocessingCanvas" xmlns:mc="http://schemas.openxmlformats.org/markup-compatibility/2006" xmlns:o="urn:schemas-microsoft-com:office:office" xmlns:r="http://schemas.openxmlformats.org/officeDocument/2006/relationships" xmlns:m="http://schemas.openxmlformats.org/officeDocument/2006/math" xmlns:v="urn:schemas-microsoft-com:vml" xmlns:wp14="http://schemas.microsoft.com/office/word/2010/wordprocessingDrawing" xmlns:wp="http://schemas.openxmlformats.org/drawingml/2006/wordprocessingDrawing" xmlns:w10="urn:schemas-microsoft-com:office:word" xmlns:w="http://schemas.openxmlformats.org/wordprocessingml/2006/main" xmlns:w14="http://schemas.microsoft.com/office/word/2010/wordml" xmlns:wpg="http://schemas.microsoft.com/office/word/2010/wordprocessingGroup" xmlns:wpi="http://schemas.microsoft.com/office/word/2010/wordprocessingInk" xmlns:wne="http://schemas.microsoft.com/office/word/2006/wordml" xmlns:wps="http://schemas.microsoft.com/office/word/2010/wordprocessingShape" mc:Ignorable="w14 wp14">
+  <w:endnote w:type="separator" w:id="-1">
+    <w:p>
+      <w:pPr>
+        <w:spacing w:after="0" w:line="240" w:lineRule="auto"/>
+      </w:pPr>
+      <w:r>
+        <w:separator/>
+      </w:r>
+    </w:p>
+  </w:endnote>
+  <w:endnote w:type="continuationSeparator" w:id="0">
+    <w:p>
+      <w:pPr>
+        <w:spacing w:after="0" w:line="240" w:lineRule="auto"/>
+      </w:pPr>
+      <w:r>
+        <w:continuationSeparator/>
+      </w:r>
+    </w:p>
+  </w:endnote>
+</w:endnotes>
+</file>
+
+<file path=word/footnotes.xml><?xml version="1.0" encoding="utf-8"?>
+<w:footnotes xmlns:wpc="http://schemas.microsoft.com/office/word/2010/wordprocessingCanvas" xmlns:mc="http://schemas.openxmlformats.org/markup-compatibility/2006" xmlns:o="urn:schemas-microsoft-com:office:office" xmlns:r="http://schemas.openxmlformats.org/officeDocument/2006/relationships" xmlns:m="http://schemas.openxmlformats.org/officeDocument/2006/math" xmlns:v="urn:schemas-microsoft-com:vml" xmlns:wp14="http://schemas.microsoft.com/office/word/2010/wordprocessingDrawing" xmlns:wp="http://schemas.openxmlformats.org/drawingml/2006/wordprocessingDrawing" xmlns:w10="urn:schemas-microsoft-com:office:word" xmlns:w="http://schemas.openxmlformats.org/wordprocessingml/2006/main" xmlns:w14="http://schemas.microsoft.com/office/word/2010/wordml" xmlns:wpg="http://schemas.microsoft.com/office/word/2010/wordprocessingGroup" xmlns:wpi="http://schemas.microsoft.com/office/word/2010/wordprocessingInk" xmlns:wne="http://schemas.microsoft.com/office/word/2006/wordml" xmlns:wps="http://schemas.microsoft.com/office/word/2010/wordprocessingShape" mc:Ignorable="w14 wp14">
+  <w:footnote w:type="separator" w:id="-1">
+    <w:p>
+      <w:pPr>
+        <w:spacing w:after="0" w:line="240" w:lineRule="auto"/>
+      </w:pPr>
+      <w:r>
+        <w:separator/>
+      </w:r>
+    </w:p>
+  </w:footnote>
+  <w:footnote w:type="continuationSeparator" w:id="0">
+    <w:p>
+      <w:pPr>
+        <w:spacing w:after="0" w:line="240" w:lineRule="auto"/>
+      </w:pPr>
+      <w:r>
+        <w:continuationSeparator/>
+      </w:r>
+    </w:p>
+  </w:footnote>
+</w:footnotes>
+</file>
+
 <file path=word/header1.xml><?xml version="1.0" encoding="utf-8"?>
-<w:hdr xmlns:o="urn:schemas-microsoft-com:office:office" xmlns:r="http://schemas.openxmlformats.org/officeDocument/2006/relationships" xmlns:v="urn:schemas-microsoft-com:vml" xmlns:w="http://schemas.openxmlformats.org/wordprocessingml/2006/main" xmlns:w10="urn:schemas-microsoft-com:office:word" xmlns:wp="http://schemas.openxmlformats.org/drawingml/2006/wordprocessingDrawing" xmlns:wps="http://schemas.microsoft.com/office/word/2010/wordprocessingShape" xmlns:wpg="http://schemas.microsoft.com/office/word/2010/wordprocessingGroup" xmlns:mc="http://schemas.openxmlformats.org/markup-compatibility/2006" xmlns:wp14="http://schemas.microsoft.com/office/word/2010/wordprocessingDrawing" xmlns:w14="http://schemas.microsoft.com/office/word/2010/wordml" xmlns:w15="http://schemas.microsoft.com/office/word/2012/wordml" mc:Ignorable="w14 wp14 w15">
+<w:hdr xmlns:wpc="http://schemas.microsoft.com/office/word/2010/wordprocessingCanvas" xmlns:mc="http://schemas.openxmlformats.org/markup-compatibility/2006" xmlns:o="urn:schemas-microsoft-com:office:office" xmlns:r="http://schemas.openxmlformats.org/officeDocument/2006/relationships" xmlns:m="http://schemas.openxmlformats.org/officeDocument/2006/math" xmlns:v="urn:schemas-microsoft-com:vml" xmlns:wp14="http://schemas.microsoft.com/office/word/2010/wordprocessingDrawing" xmlns:wp="http://schemas.openxmlformats.org/drawingml/2006/wordprocessingDrawing" xmlns:w10="urn:schemas-microsoft-com:office:word" xmlns:w="http://schemas.openxmlformats.org/wordprocessingml/2006/main" xmlns:w14="http://schemas.microsoft.com/office/word/2010/wordml" xmlns:wpg="http://schemas.microsoft.com/office/word/2010/wordprocessingGroup" xmlns:wpi="http://schemas.microsoft.com/office/word/2010/wordprocessingInk" xmlns:wne="http://schemas.microsoft.com/office/word/2006/wordml" xmlns:wps="http://schemas.microsoft.com/office/word/2010/wordprocessingShape" mc:Ignorable="w14 wp14">
   <w:p>
     <w:pPr>
-      <w:pStyle w:val="Cabecera"/>
-      <w:suppressLineNumbers/>
-      <w:spacing w:before="0" w:after="200"/>
-      <w:rPr/>
+      <w:pStyle w:val="Encabezado"/>
     </w:pPr>
-    <w:r>
-      <w:rPr/>
-    </w:r>
   </w:p>
 </w:hdr>
 </file>
 
 <file path=word/numbering.xml><?xml version="1.0" encoding="utf-8"?>
-<w:numbering xmlns:w="http://schemas.openxmlformats.org/wordprocessingml/2006/main" xmlns:o="urn:schemas-microsoft-com:office:office" xmlns:r="http://schemas.openxmlformats.org/officeDocument/2006/relationships" xmlns:v="urn:schemas-microsoft-com:vml" xmlns:mc="http://schemas.openxmlformats.org/markup-compatibility/2006" xmlns:w14="http://schemas.microsoft.com/office/word/2010/wordml" mc:Ignorable="w14">
-  <w:abstractNum w:abstractNumId="1">
+<w:numbering xmlns:wpc="http://schemas.microsoft.com/office/word/2010/wordprocessingCanvas" xmlns:mc="http://schemas.openxmlformats.org/markup-compatibility/2006" xmlns:o="urn:schemas-microsoft-com:office:office" xmlns:r="http://schemas.openxmlformats.org/officeDocument/2006/relationships" xmlns:m="http://schemas.openxmlformats.org/officeDocument/2006/math" xmlns:v="urn:schemas-microsoft-com:vml" xmlns:wp14="http://schemas.microsoft.com/office/word/2010/wordprocessingDrawing" xmlns:wp="http://schemas.openxmlformats.org/drawingml/2006/wordprocessingDrawing" xmlns:w10="urn:schemas-microsoft-com:office:word" xmlns:w="http://schemas.openxmlformats.org/wordprocessingml/2006/main" xmlns:w14="http://schemas.microsoft.com/office/word/2010/wordml" xmlns:wpg="http://schemas.microsoft.com/office/word/2010/wordprocessingGroup" xmlns:wpi="http://schemas.microsoft.com/office/word/2010/wordprocessingInk" xmlns:wne="http://schemas.microsoft.com/office/word/2006/wordml" xmlns:wps="http://schemas.microsoft.com/office/word/2010/wordprocessingShape" mc:Ignorable="w14 wp14">
+  <w:abstractNum w:abstractNumId="0">
+    <w:nsid w:val="248C416F"/>
+    <w:multiLevelType w:val="multilevel"/>
+    <w:tmpl w:val="0AB2BD32"/>
     <w:lvl w:ilvl="0">
       <w:start w:val="1"/>
       <w:numFmt w:val="bullet"/>
@@ -463,7 +523,10 @@
       </w:rPr>
     </w:lvl>
   </w:abstractNum>
-  <w:abstractNum w:abstractNumId="2">
+  <w:abstractNum w:abstractNumId="1">
+    <w:nsid w:val="604335F1"/>
+    <w:multiLevelType w:val="multilevel"/>
+    <w:tmpl w:val="42728D32"/>
     <w:lvl w:ilvl="0">
       <w:start w:val="1"/>
       <w:numFmt w:val="none"/>
@@ -474,7 +537,7 @@
         <w:tabs>
           <w:tab w:val="num" w:pos="0"/>
         </w:tabs>
-        <w:ind w:left="0" w:hanging="0"/>
+        <w:ind w:left="0" w:firstLine="0"/>
       </w:pPr>
     </w:lvl>
     <w:lvl w:ilvl="1">
@@ -487,7 +550,7 @@
         <w:tabs>
           <w:tab w:val="num" w:pos="0"/>
         </w:tabs>
-        <w:ind w:left="0" w:hanging="0"/>
+        <w:ind w:left="0" w:firstLine="0"/>
       </w:pPr>
     </w:lvl>
     <w:lvl w:ilvl="2">
@@ -500,7 +563,7 @@
         <w:tabs>
           <w:tab w:val="num" w:pos="0"/>
         </w:tabs>
-        <w:ind w:left="0" w:hanging="0"/>
+        <w:ind w:left="0" w:firstLine="0"/>
       </w:pPr>
     </w:lvl>
     <w:lvl w:ilvl="3">
@@ -513,7 +576,7 @@
         <w:tabs>
           <w:tab w:val="num" w:pos="0"/>
         </w:tabs>
-        <w:ind w:left="0" w:hanging="0"/>
+        <w:ind w:left="0" w:firstLine="0"/>
       </w:pPr>
     </w:lvl>
     <w:lvl w:ilvl="4">
@@ -526,7 +589,7 @@
         <w:tabs>
           <w:tab w:val="num" w:pos="0"/>
         </w:tabs>
-        <w:ind w:left="0" w:hanging="0"/>
+        <w:ind w:left="0" w:firstLine="0"/>
       </w:pPr>
     </w:lvl>
     <w:lvl w:ilvl="5">
@@ -539,7 +602,7 @@
         <w:tabs>
           <w:tab w:val="num" w:pos="0"/>
         </w:tabs>
-        <w:ind w:left="0" w:hanging="0"/>
+        <w:ind w:left="0" w:firstLine="0"/>
       </w:pPr>
     </w:lvl>
     <w:lvl w:ilvl="6">
@@ -552,7 +615,7 @@
         <w:tabs>
           <w:tab w:val="num" w:pos="0"/>
         </w:tabs>
-        <w:ind w:left="0" w:hanging="0"/>
+        <w:ind w:left="0" w:firstLine="0"/>
       </w:pPr>
     </w:lvl>
     <w:lvl w:ilvl="7">
@@ -565,7 +628,7 @@
         <w:tabs>
           <w:tab w:val="num" w:pos="0"/>
         </w:tabs>
-        <w:ind w:left="0" w:hanging="0"/>
+        <w:ind w:left="0" w:firstLine="0"/>
       </w:pPr>
     </w:lvl>
     <w:lvl w:ilvl="8">
@@ -578,25 +641,25 @@
         <w:tabs>
           <w:tab w:val="num" w:pos="0"/>
         </w:tabs>
-        <w:ind w:left="0" w:hanging="0"/>
+        <w:ind w:left="0" w:firstLine="0"/>
       </w:pPr>
     </w:lvl>
   </w:abstractNum>
   <w:num w:numId="1">
-    <w:abstractNumId w:val="1"/>
+    <w:abstractNumId w:val="0"/>
   </w:num>
   <w:num w:numId="2">
-    <w:abstractNumId w:val="2"/>
+    <w:abstractNumId w:val="1"/>
   </w:num>
 </w:numbering>
 </file>
 
 <file path=word/styles.xml><?xml version="1.0" encoding="utf-8"?>
-<w:styles xmlns:w="http://schemas.openxmlformats.org/wordprocessingml/2006/main" xmlns:w14="http://schemas.microsoft.com/office/word/2010/wordml" xmlns:mc="http://schemas.openxmlformats.org/markup-compatibility/2006" mc:Ignorable="w14">
+<w:styles xmlns:mc="http://schemas.openxmlformats.org/markup-compatibility/2006" xmlns:r="http://schemas.openxmlformats.org/officeDocument/2006/relationships" xmlns:w="http://schemas.openxmlformats.org/wordprocessingml/2006/main" xmlns:w14="http://schemas.microsoft.com/office/word/2010/wordml" mc:Ignorable="w14">
   <w:docDefaults>
     <w:rPrDefault>
       <w:rPr>
-        <w:rFonts w:ascii="Calibri" w:hAnsi="Calibri" w:eastAsia="Calibri" w:cs="" w:asciiTheme="minorHAnsi" w:cstheme="minorBidi" w:eastAsiaTheme="minorHAnsi" w:hAnsiTheme="minorHAnsi"/>
+        <w:rFonts w:asciiTheme="minorHAnsi" w:eastAsiaTheme="minorHAnsi" w:hAnsiTheme="minorHAnsi" w:cstheme="minorBidi"/>
         <w:sz w:val="22"/>
         <w:szCs w:val="22"/>
         <w:lang w:val="es-ES" w:eastAsia="en-US" w:bidi="ar-SA"/>
@@ -604,13 +667,13 @@
     </w:rPrDefault>
     <w:pPrDefault>
       <w:pPr>
-        <w:suppressAutoHyphens w:val="true"/>
+        <w:suppressAutoHyphens/>
       </w:pPr>
     </w:pPrDefault>
   </w:docDefaults>
   <w:latentStyles w:defLockedState="0" w:defUIPriority="99" w:defSemiHidden="1" w:defUnhideWhenUsed="1" w:defQFormat="0" w:count="267">
-    <w:lsdException w:name="Normal" w:uiPriority="0" w:semiHidden="0" w:unhideWhenUsed="0" w:qFormat="1"/>
-    <w:lsdException w:name="heading 1" w:uiPriority="9" w:semiHidden="0" w:unhideWhenUsed="0" w:qFormat="1"/>
+    <w:lsdException w:name="Normal" w:semiHidden="0" w:uiPriority="0" w:unhideWhenUsed="0" w:qFormat="1"/>
+    <w:lsdException w:name="heading 1" w:semiHidden="0" w:uiPriority="9" w:unhideWhenUsed="0" w:qFormat="1"/>
     <w:lsdException w:name="heading 2" w:uiPriority="9" w:qFormat="1"/>
     <w:lsdException w:name="heading 3" w:uiPriority="9" w:qFormat="1"/>
     <w:lsdException w:name="heading 4" w:uiPriority="9" w:qFormat="1"/>
@@ -629,165 +692,173 @@
     <w:lsdException w:name="toc 8" w:uiPriority="39"/>
     <w:lsdException w:name="toc 9" w:uiPriority="39"/>
     <w:lsdException w:name="caption" w:uiPriority="35" w:qFormat="1"/>
-    <w:lsdException w:name="Title" w:uiPriority="10" w:semiHidden="0" w:unhideWhenUsed="0" w:qFormat="1"/>
+    <w:lsdException w:name="Title" w:semiHidden="0" w:uiPriority="10" w:unhideWhenUsed="0" w:qFormat="1"/>
     <w:lsdException w:name="Default Paragraph Font" w:uiPriority="1"/>
-    <w:lsdException w:name="Subtitle" w:uiPriority="11" w:semiHidden="0" w:unhideWhenUsed="0" w:qFormat="1"/>
-    <w:lsdException w:name="Strong" w:uiPriority="22" w:semiHidden="0" w:unhideWhenUsed="0" w:qFormat="1"/>
-    <w:lsdException w:name="Emphasis" w:uiPriority="20" w:semiHidden="0" w:unhideWhenUsed="0" w:qFormat="1"/>
-    <w:lsdException w:name="Table Grid" w:uiPriority="59" w:semiHidden="0" w:unhideWhenUsed="0"/>
+    <w:lsdException w:name="Subtitle" w:semiHidden="0" w:uiPriority="11" w:unhideWhenUsed="0" w:qFormat="1"/>
+    <w:lsdException w:name="Strong" w:semiHidden="0" w:uiPriority="22" w:unhideWhenUsed="0" w:qFormat="1"/>
+    <w:lsdException w:name="Emphasis" w:semiHidden="0" w:uiPriority="20" w:unhideWhenUsed="0" w:qFormat="1"/>
+    <w:lsdException w:name="Table Grid" w:semiHidden="0" w:uiPriority="59" w:unhideWhenUsed="0"/>
     <w:lsdException w:name="Placeholder Text" w:unhideWhenUsed="0"/>
-    <w:lsdException w:name="No Spacing" w:uiPriority="1" w:semiHidden="0" w:unhideWhenUsed="0" w:qFormat="1"/>
-    <w:lsdException w:name="Light Shading" w:uiPriority="60" w:semiHidden="0" w:unhideWhenUsed="0"/>
-    <w:lsdException w:name="Light List" w:uiPriority="61" w:semiHidden="0" w:unhideWhenUsed="0"/>
-    <w:lsdException w:name="Light Grid" w:uiPriority="62" w:semiHidden="0" w:unhideWhenUsed="0"/>
-    <w:lsdException w:name="Medium Shading 1" w:uiPriority="63" w:semiHidden="0" w:unhideWhenUsed="0"/>
-    <w:lsdException w:name="Medium Shading 2" w:uiPriority="64" w:semiHidden="0" w:unhideWhenUsed="0"/>
-    <w:lsdException w:name="Medium List 1" w:uiPriority="65" w:semiHidden="0" w:unhideWhenUsed="0"/>
-    <w:lsdException w:name="Medium List 2" w:uiPriority="66" w:semiHidden="0" w:unhideWhenUsed="0"/>
-    <w:lsdException w:name="Medium Grid 1" w:uiPriority="67" w:semiHidden="0" w:unhideWhenUsed="0"/>
-    <w:lsdException w:name="Medium Grid 2" w:uiPriority="68" w:semiHidden="0" w:unhideWhenUsed="0"/>
-    <w:lsdException w:name="Medium Grid 3" w:uiPriority="69" w:semiHidden="0" w:unhideWhenUsed="0"/>
-    <w:lsdException w:name="Dark List" w:uiPriority="70" w:semiHidden="0" w:unhideWhenUsed="0"/>
-    <w:lsdException w:name="Colorful Shading" w:uiPriority="71" w:semiHidden="0" w:unhideWhenUsed="0"/>
-    <w:lsdException w:name="Colorful List" w:uiPriority="72" w:semiHidden="0" w:unhideWhenUsed="0"/>
-    <w:lsdException w:name="Colorful Grid" w:uiPriority="73" w:semiHidden="0" w:unhideWhenUsed="0"/>
-    <w:lsdException w:name="Light Shading Accent 1" w:uiPriority="60" w:semiHidden="0" w:unhideWhenUsed="0"/>
-    <w:lsdException w:name="Light List Accent 1" w:uiPriority="61" w:semiHidden="0" w:unhideWhenUsed="0"/>
-    <w:lsdException w:name="Light Grid Accent 1" w:uiPriority="62" w:semiHidden="0" w:unhideWhenUsed="0"/>
-    <w:lsdException w:name="Medium Shading 1 Accent 1" w:uiPriority="63" w:semiHidden="0" w:unhideWhenUsed="0"/>
-    <w:lsdException w:name="Medium Shading 2 Accent 1" w:uiPriority="64" w:semiHidden="0" w:unhideWhenUsed="0"/>
-    <w:lsdException w:name="Medium List 1 Accent 1" w:uiPriority="65" w:semiHidden="0" w:unhideWhenUsed="0"/>
+    <w:lsdException w:name="No Spacing" w:semiHidden="0" w:uiPriority="1" w:unhideWhenUsed="0" w:qFormat="1"/>
+    <w:lsdException w:name="Light Shading" w:semiHidden="0" w:uiPriority="60" w:unhideWhenUsed="0"/>
+    <w:lsdException w:name="Light List" w:semiHidden="0" w:uiPriority="61" w:unhideWhenUsed="0"/>
+    <w:lsdException w:name="Light Grid" w:semiHidden="0" w:uiPriority="62" w:unhideWhenUsed="0"/>
+    <w:lsdException w:name="Medium Shading 1" w:semiHidden="0" w:uiPriority="63" w:unhideWhenUsed="0"/>
+    <w:lsdException w:name="Medium Shading 2" w:semiHidden="0" w:uiPriority="64" w:unhideWhenUsed="0"/>
+    <w:lsdException w:name="Medium List 1" w:semiHidden="0" w:uiPriority="65" w:unhideWhenUsed="0"/>
+    <w:lsdException w:name="Medium List 2" w:semiHidden="0" w:uiPriority="66" w:unhideWhenUsed="0"/>
+    <w:lsdException w:name="Medium Grid 1" w:semiHidden="0" w:uiPriority="67" w:unhideWhenUsed="0"/>
+    <w:lsdException w:name="Medium Grid 2" w:semiHidden="0" w:uiPriority="68" w:unhideWhenUsed="0"/>
+    <w:lsdException w:name="Medium Grid 3" w:semiHidden="0" w:uiPriority="69" w:unhideWhenUsed="0"/>
+    <w:lsdException w:name="Dark List" w:semiHidden="0" w:uiPriority="70" w:unhideWhenUsed="0"/>
+    <w:lsdException w:name="Colorful Shading" w:semiHidden="0" w:uiPriority="71" w:unhideWhenUsed="0"/>
+    <w:lsdException w:name="Colorful List" w:semiHidden="0" w:uiPriority="72" w:unhideWhenUsed="0"/>
+    <w:lsdException w:name="Colorful Grid" w:semiHidden="0" w:uiPriority="73" w:unhideWhenUsed="0"/>
+    <w:lsdException w:name="Light Shading Accent 1" w:semiHidden="0" w:uiPriority="60" w:unhideWhenUsed="0"/>
+    <w:lsdException w:name="Light List Accent 1" w:semiHidden="0" w:uiPriority="61" w:unhideWhenUsed="0"/>
+    <w:lsdException w:name="Light Grid Accent 1" w:semiHidden="0" w:uiPriority="62" w:unhideWhenUsed="0"/>
+    <w:lsdException w:name="Medium Shading 1 Accent 1" w:semiHidden="0" w:uiPriority="63" w:unhideWhenUsed="0"/>
+    <w:lsdException w:name="Medium Shading 2 Accent 1" w:semiHidden="0" w:uiPriority="64" w:unhideWhenUsed="0"/>
+    <w:lsdException w:name="Medium List 1 Accent 1" w:semiHidden="0" w:uiPriority="65" w:unhideWhenUsed="0"/>
     <w:lsdException w:name="Revision" w:unhideWhenUsed="0"/>
-    <w:lsdException w:name="List Paragraph" w:uiPriority="34" w:semiHidden="0" w:unhideWhenUsed="0" w:qFormat="1"/>
-    <w:lsdException w:name="Quote" w:uiPriority="29" w:semiHidden="0" w:unhideWhenUsed="0" w:qFormat="1"/>
-    <w:lsdException w:name="Intense Quote" w:uiPriority="30" w:semiHidden="0" w:unhideWhenUsed="0" w:qFormat="1"/>
-    <w:lsdException w:name="Medium List 2 Accent 1" w:uiPriority="66" w:semiHidden="0" w:unhideWhenUsed="0"/>
-    <w:lsdException w:name="Medium Grid 1 Accent 1" w:uiPriority="67" w:semiHidden="0" w:unhideWhenUsed="0"/>
-    <w:lsdException w:name="Medium Grid 2 Accent 1" w:uiPriority="68" w:semiHidden="0" w:unhideWhenUsed="0"/>
-    <w:lsdException w:name="Medium Grid 3 Accent 1" w:uiPriority="69" w:semiHidden="0" w:unhideWhenUsed="0"/>
-    <w:lsdException w:name="Dark List Accent 1" w:uiPriority="70" w:semiHidden="0" w:unhideWhenUsed="0"/>
-    <w:lsdException w:name="Colorful Shading Accent 1" w:uiPriority="71" w:semiHidden="0" w:unhideWhenUsed="0"/>
-    <w:lsdException w:name="Colorful List Accent 1" w:uiPriority="72" w:semiHidden="0" w:unhideWhenUsed="0"/>
-    <w:lsdException w:name="Colorful Grid Accent 1" w:uiPriority="73" w:semiHidden="0" w:unhideWhenUsed="0"/>
-    <w:lsdException w:name="Light Shading Accent 2" w:uiPriority="60" w:semiHidden="0" w:unhideWhenUsed="0"/>
-    <w:lsdException w:name="Light List Accent 2" w:uiPriority="61" w:semiHidden="0" w:unhideWhenUsed="0"/>
-    <w:lsdException w:name="Light Grid Accent 2" w:uiPriority="62" w:semiHidden="0" w:unhideWhenUsed="0"/>
-    <w:lsdException w:name="Medium Shading 1 Accent 2" w:uiPriority="63" w:semiHidden="0" w:unhideWhenUsed="0"/>
-    <w:lsdException w:name="Medium Shading 2 Accent 2" w:uiPriority="64" w:semiHidden="0" w:unhideWhenUsed="0"/>
-    <w:lsdException w:name="Medium List 1 Accent 2" w:uiPriority="65" w:semiHidden="0" w:unhideWhenUsed="0"/>
-    <w:lsdException w:name="Medium List 2 Accent 2" w:uiPriority="66" w:semiHidden="0" w:unhideWhenUsed="0"/>
-    <w:lsdException w:name="Medium Grid 1 Accent 2" w:uiPriority="67" w:semiHidden="0" w:unhideWhenUsed="0"/>
-    <w:lsdException w:name="Medium Grid 2 Accent 2" w:uiPriority="68" w:semiHidden="0" w:unhideWhenUsed="0"/>
-    <w:lsdException w:name="Medium Grid 3 Accent 2" w:uiPriority="69" w:semiHidden="0" w:unhideWhenUsed="0"/>
-    <w:lsdException w:name="Dark List Accent 2" w:uiPriority="70" w:semiHidden="0" w:unhideWhenUsed="0"/>
-    <w:lsdException w:name="Colorful Shading Accent 2" w:uiPriority="71" w:semiHidden="0" w:unhideWhenUsed="0"/>
-    <w:lsdException w:name="Colorful List Accent 2" w:uiPriority="72" w:semiHidden="0" w:unhideWhenUsed="0"/>
-    <w:lsdException w:name="Colorful Grid Accent 2" w:uiPriority="73" w:semiHidden="0" w:unhideWhenUsed="0"/>
-    <w:lsdException w:name="Light Shading Accent 3" w:uiPriority="60" w:semiHidden="0" w:unhideWhenUsed="0"/>
-    <w:lsdException w:name="Light List Accent 3" w:uiPriority="61" w:semiHidden="0" w:unhideWhenUsed="0"/>
-    <w:lsdException w:name="Light Grid Accent 3" w:uiPriority="62" w:semiHidden="0" w:unhideWhenUsed="0"/>
-    <w:lsdException w:name="Medium Shading 1 Accent 3" w:uiPriority="63" w:semiHidden="0" w:unhideWhenUsed="0"/>
-    <w:lsdException w:name="Medium Shading 2 Accent 3" w:uiPriority="64" w:semiHidden="0" w:unhideWhenUsed="0"/>
-    <w:lsdException w:name="Medium List 1 Accent 3" w:uiPriority="65" w:semiHidden="0" w:unhideWhenUsed="0"/>
-    <w:lsdException w:name="Medium List 2 Accent 3" w:uiPriority="66" w:semiHidden="0" w:unhideWhenUsed="0"/>
-    <w:lsdException w:name="Medium Grid 1 Accent 3" w:uiPriority="67" w:semiHidden="0" w:unhideWhenUsed="0"/>
-    <w:lsdException w:name="Medium Grid 2 Accent 3" w:uiPriority="68" w:semiHidden="0" w:unhideWhenUsed="0"/>
-    <w:lsdException w:name="Medium Grid 3 Accent 3" w:uiPriority="69" w:semiHidden="0" w:unhideWhenUsed="0"/>
-    <w:lsdException w:name="Dark List Accent 3" w:uiPriority="70" w:semiHidden="0" w:unhideWhenUsed="0"/>
-    <w:lsdException w:name="Colorful Shading Accent 3" w:uiPriority="71" w:semiHidden="0" w:unhideWhenUsed="0"/>
-    <w:lsdException w:name="Colorful List Accent 3" w:uiPriority="72" w:semiHidden="0" w:unhideWhenUsed="0"/>
-    <w:lsdException w:name="Colorful Grid Accent 3" w:uiPriority="73" w:semiHidden="0" w:unhideWhenUsed="0"/>
-    <w:lsdException w:name="Light Shading Accent 4" w:uiPriority="60" w:semiHidden="0" w:unhideWhenUsed="0"/>
-    <w:lsdException w:name="Light List Accent 4" w:uiPriority="61" w:semiHidden="0" w:unhideWhenUsed="0"/>
-    <w:lsdException w:name="Light Grid Accent 4" w:uiPriority="62" w:semiHidden="0" w:unhideWhenUsed="0"/>
-    <w:lsdException w:name="Medium Shading 1 Accent 4" w:uiPriority="63" w:semiHidden="0" w:unhideWhenUsed="0"/>
-    <w:lsdException w:name="Medium Shading 2 Accent 4" w:uiPriority="64" w:semiHidden="0" w:unhideWhenUsed="0"/>
-    <w:lsdException w:name="Medium List 1 Accent 4" w:uiPriority="65" w:semiHidden="0" w:unhideWhenUsed="0"/>
-    <w:lsdException w:name="Medium List 2 Accent 4" w:uiPriority="66" w:semiHidden="0" w:unhideWhenUsed="0"/>
-    <w:lsdException w:name="Medium Grid 1 Accent 4" w:uiPriority="67" w:semiHidden="0" w:unhideWhenUsed="0"/>
-    <w:lsdException w:name="Medium Grid 2 Accent 4" w:uiPriority="68" w:semiHidden="0" w:unhideWhenUsed="0"/>
-    <w:lsdException w:name="Medium Grid 3 Accent 4" w:uiPriority="69" w:semiHidden="0" w:unhideWhenUsed="0"/>
-    <w:lsdException w:name="Dark List Accent 4" w:uiPriority="70" w:semiHidden="0" w:unhideWhenUsed="0"/>
-    <w:lsdException w:name="Colorful Shading Accent 4" w:uiPriority="71" w:semiHidden="0" w:unhideWhenUsed="0"/>
-    <w:lsdException w:name="Colorful List Accent 4" w:uiPriority="72" w:semiHidden="0" w:unhideWhenUsed="0"/>
-    <w:lsdException w:name="Colorful Grid Accent 4" w:uiPriority="73" w:semiHidden="0" w:unhideWhenUsed="0"/>
-    <w:lsdException w:name="Light Shading Accent 5" w:uiPriority="60" w:semiHidden="0" w:unhideWhenUsed="0"/>
-    <w:lsdException w:name="Light List Accent 5" w:uiPriority="61" w:semiHidden="0" w:unhideWhenUsed="0"/>
-    <w:lsdException w:name="Light Grid Accent 5" w:uiPriority="62" w:semiHidden="0" w:unhideWhenUsed="0"/>
-    <w:lsdException w:name="Medium Shading 1 Accent 5" w:uiPriority="63" w:semiHidden="0" w:unhideWhenUsed="0"/>
-    <w:lsdException w:name="Medium Shading 2 Accent 5" w:uiPriority="64" w:semiHidden="0" w:unhideWhenUsed="0"/>
-    <w:lsdException w:name="Medium List 1 Accent 5" w:uiPriority="65" w:semiHidden="0" w:unhideWhenUsed="0"/>
-    <w:lsdException w:name="Medium List 2 Accent 5" w:uiPriority="66" w:semiHidden="0" w:unhideWhenUsed="0"/>
-    <w:lsdException w:name="Medium Grid 1 Accent 5" w:uiPriority="67" w:semiHidden="0" w:unhideWhenUsed="0"/>
-    <w:lsdException w:name="Medium Grid 2 Accent 5" w:uiPriority="68" w:semiHidden="0" w:unhideWhenUsed="0"/>
-    <w:lsdException w:name="Medium Grid 3 Accent 5" w:uiPriority="69" w:semiHidden="0" w:unhideWhenUsed="0"/>
-    <w:lsdException w:name="Dark List Accent 5" w:uiPriority="70" w:semiHidden="0" w:unhideWhenUsed="0"/>
-    <w:lsdException w:name="Colorful Shading Accent 5" w:uiPriority="71" w:semiHidden="0" w:unhideWhenUsed="0"/>
-    <w:lsdException w:name="Colorful List Accent 5" w:uiPriority="72" w:semiHidden="0" w:unhideWhenUsed="0"/>
-    <w:lsdException w:name="Colorful Grid Accent 5" w:uiPriority="73" w:semiHidden="0" w:unhideWhenUsed="0"/>
-    <w:lsdException w:name="Light Shading Accent 6" w:uiPriority="60" w:semiHidden="0" w:unhideWhenUsed="0"/>
-    <w:lsdException w:name="Light List Accent 6" w:uiPriority="61" w:semiHidden="0" w:unhideWhenUsed="0"/>
-    <w:lsdException w:name="Light Grid Accent 6" w:uiPriority="62" w:semiHidden="0" w:unhideWhenUsed="0"/>
-    <w:lsdException w:name="Medium Shading 1 Accent 6" w:uiPriority="63" w:semiHidden="0" w:unhideWhenUsed="0"/>
-    <w:lsdException w:name="Medium Shading 2 Accent 6" w:uiPriority="64" w:semiHidden="0" w:unhideWhenUsed="0"/>
-    <w:lsdException w:name="Medium List 1 Accent 6" w:uiPriority="65" w:semiHidden="0" w:unhideWhenUsed="0"/>
-    <w:lsdException w:name="Medium List 2 Accent 6" w:uiPriority="66" w:semiHidden="0" w:unhideWhenUsed="0"/>
-    <w:lsdException w:name="Medium Grid 1 Accent 6" w:uiPriority="67" w:semiHidden="0" w:unhideWhenUsed="0"/>
-    <w:lsdException w:name="Medium Grid 2 Accent 6" w:uiPriority="68" w:semiHidden="0" w:unhideWhenUsed="0"/>
-    <w:lsdException w:name="Medium Grid 3 Accent 6" w:uiPriority="69" w:semiHidden="0" w:unhideWhenUsed="0"/>
-    <w:lsdException w:name="Dark List Accent 6" w:uiPriority="70" w:semiHidden="0" w:unhideWhenUsed="0"/>
-    <w:lsdException w:name="Colorful Shading Accent 6" w:uiPriority="71" w:semiHidden="0" w:unhideWhenUsed="0"/>
-    <w:lsdException w:name="Colorful List Accent 6" w:uiPriority="72" w:semiHidden="0" w:unhideWhenUsed="0"/>
-    <w:lsdException w:name="Colorful Grid Accent 6" w:uiPriority="73" w:semiHidden="0" w:unhideWhenUsed="0"/>
-    <w:lsdException w:name="Subtle Emphasis" w:uiPriority="19" w:semiHidden="0" w:unhideWhenUsed="0" w:qFormat="1"/>
-    <w:lsdException w:name="Intense Emphasis" w:uiPriority="21" w:semiHidden="0" w:unhideWhenUsed="0" w:qFormat="1"/>
-    <w:lsdException w:name="Subtle Reference" w:uiPriority="31" w:semiHidden="0" w:unhideWhenUsed="0" w:qFormat="1"/>
-    <w:lsdException w:name="Intense Reference" w:uiPriority="32" w:semiHidden="0" w:unhideWhenUsed="0" w:qFormat="1"/>
-    <w:lsdException w:name="Book Title" w:uiPriority="33" w:semiHidden="0" w:unhideWhenUsed="0" w:qFormat="1"/>
+    <w:lsdException w:name="List Paragraph" w:semiHidden="0" w:uiPriority="34" w:unhideWhenUsed="0" w:qFormat="1"/>
+    <w:lsdException w:name="Quote" w:semiHidden="0" w:uiPriority="29" w:unhideWhenUsed="0" w:qFormat="1"/>
+    <w:lsdException w:name="Intense Quote" w:semiHidden="0" w:uiPriority="30" w:unhideWhenUsed="0" w:qFormat="1"/>
+    <w:lsdException w:name="Medium List 2 Accent 1" w:semiHidden="0" w:uiPriority="66" w:unhideWhenUsed="0"/>
+    <w:lsdException w:name="Medium Grid 1 Accent 1" w:semiHidden="0" w:uiPriority="67" w:unhideWhenUsed="0"/>
+    <w:lsdException w:name="Medium Grid 2 Accent 1" w:semiHidden="0" w:uiPriority="68" w:unhideWhenUsed="0"/>
+    <w:lsdException w:name="Medium Grid 3 Accent 1" w:semiHidden="0" w:uiPriority="69" w:unhideWhenUsed="0"/>
+    <w:lsdException w:name="Dark List Accent 1" w:semiHidden="0" w:uiPriority="70" w:unhideWhenUsed="0"/>
+    <w:lsdException w:name="Colorful Shading Accent 1" w:semiHidden="0" w:uiPriority="71" w:unhideWhenUsed="0"/>
+    <w:lsdException w:name="Colorful List Accent 1" w:semiHidden="0" w:uiPriority="72" w:unhideWhenUsed="0"/>
+    <w:lsdException w:name="Colorful Grid Accent 1" w:semiHidden="0" w:uiPriority="73" w:unhideWhenUsed="0"/>
+    <w:lsdException w:name="Light Shading Accent 2" w:semiHidden="0" w:uiPriority="60" w:unhideWhenUsed="0"/>
+    <w:lsdException w:name="Light List Accent 2" w:semiHidden="0" w:uiPriority="61" w:unhideWhenUsed="0"/>
+    <w:lsdException w:name="Light Grid Accent 2" w:semiHidden="0" w:uiPriority="62" w:unhideWhenUsed="0"/>
+    <w:lsdException w:name="Medium Shading 1 Accent 2" w:semiHidden="0" w:uiPriority="63" w:unhideWhenUsed="0"/>
+    <w:lsdException w:name="Medium Shading 2 Accent 2" w:semiHidden="0" w:uiPriority="64" w:unhideWhenUsed="0"/>
+    <w:lsdException w:name="Medium List 1 Accent 2" w:semiHidden="0" w:uiPriority="65" w:unhideWhenUsed="0"/>
+    <w:lsdException w:name="Medium List 2 Accent 2" w:semiHidden="0" w:uiPriority="66" w:unhideWhenUsed="0"/>
+    <w:lsdException w:name="Medium Grid 1 Accent 2" w:semiHidden="0" w:uiPriority="67" w:unhideWhenUsed="0"/>
+    <w:lsdException w:name="Medium Grid 2 Accent 2" w:semiHidden="0" w:uiPriority="68" w:unhideWhenUsed="0"/>
+    <w:lsdException w:name="Medium Grid 3 Accent 2" w:semiHidden="0" w:uiPriority="69" w:unhideWhenUsed="0"/>
+    <w:lsdException w:name="Dark List Accent 2" w:semiHidden="0" w:uiPriority="70" w:unhideWhenUsed="0"/>
+    <w:lsdException w:name="Colorful Shading Accent 2" w:semiHidden="0" w:uiPriority="71" w:unhideWhenUsed="0"/>
+    <w:lsdException w:name="Colorful List Accent 2" w:semiHidden="0" w:uiPriority="72" w:unhideWhenUsed="0"/>
+    <w:lsdException w:name="Colorful Grid Accent 2" w:semiHidden="0" w:uiPriority="73" w:unhideWhenUsed="0"/>
+    <w:lsdException w:name="Light Shading Accent 3" w:semiHidden="0" w:uiPriority="60" w:unhideWhenUsed="0"/>
+    <w:lsdException w:name="Light List Accent 3" w:semiHidden="0" w:uiPriority="61" w:unhideWhenUsed="0"/>
+    <w:lsdException w:name="Light Grid Accent 3" w:semiHidden="0" w:uiPriority="62" w:unhideWhenUsed="0"/>
+    <w:lsdException w:name="Medium Shading 1 Accent 3" w:semiHidden="0" w:uiPriority="63" w:unhideWhenUsed="0"/>
+    <w:lsdException w:name="Medium Shading 2 Accent 3" w:semiHidden="0" w:uiPriority="64" w:unhideWhenUsed="0"/>
+    <w:lsdException w:name="Medium List 1 Accent 3" w:semiHidden="0" w:uiPriority="65" w:unhideWhenUsed="0"/>
+    <w:lsdException w:name="Medium List 2 Accent 3" w:semiHidden="0" w:uiPriority="66" w:unhideWhenUsed="0"/>
+    <w:lsdException w:name="Medium Grid 1 Accent 3" w:semiHidden="0" w:uiPriority="67" w:unhideWhenUsed="0"/>
+    <w:lsdException w:name="Medium Grid 2 Accent 3" w:semiHidden="0" w:uiPriority="68" w:unhideWhenUsed="0"/>
+    <w:lsdException w:name="Medium Grid 3 Accent 3" w:semiHidden="0" w:uiPriority="69" w:unhideWhenUsed="0"/>
+    <w:lsdException w:name="Dark List Accent 3" w:semiHidden="0" w:uiPriority="70" w:unhideWhenUsed="0"/>
+    <w:lsdException w:name="Colorful Shading Accent 3" w:semiHidden="0" w:uiPriority="71" w:unhideWhenUsed="0"/>
+    <w:lsdException w:name="Colorful List Accent 3" w:semiHidden="0" w:uiPriority="72" w:unhideWhenUsed="0"/>
+    <w:lsdException w:name="Colorful Grid Accent 3" w:semiHidden="0" w:uiPriority="73" w:unhideWhenUsed="0"/>
+    <w:lsdException w:name="Light Shading Accent 4" w:semiHidden="0" w:uiPriority="60" w:unhideWhenUsed="0"/>
+    <w:lsdException w:name="Light List Accent 4" w:semiHidden="0" w:uiPriority="61" w:unhideWhenUsed="0"/>
+    <w:lsdException w:name="Light Grid Accent 4" w:semiHidden="0" w:uiPriority="62" w:unhideWhenUsed="0"/>
+    <w:lsdException w:name="Medium Shading 1 Accent 4" w:semiHidden="0" w:uiPriority="63" w:unhideWhenUsed="0"/>
+    <w:lsdException w:name="Medium Shading 2 Accent 4" w:semiHidden="0" w:uiPriority="64" w:unhideWhenUsed="0"/>
+    <w:lsdException w:name="Medium List 1 Accent 4" w:semiHidden="0" w:uiPriority="65" w:unhideWhenUsed="0"/>
+    <w:lsdException w:name="Medium List 2 Accent 4" w:semiHidden="0" w:uiPriority="66" w:unhideWhenUsed="0"/>
+    <w:lsdException w:name="Medium Grid 1 Accent 4" w:semiHidden="0" w:uiPriority="67" w:unhideWhenUsed="0"/>
+    <w:lsdException w:name="Medium Grid 2 Accent 4" w:semiHidden="0" w:uiPriority="68" w:unhideWhenUsed="0"/>
+    <w:lsdException w:name="Medium Grid 3 Accent 4" w:semiHidden="0" w:uiPriority="69" w:unhideWhenUsed="0"/>
+    <w:lsdException w:name="Dark List Accent 4" w:semiHidden="0" w:uiPriority="70" w:unhideWhenUsed="0"/>
+    <w:lsdException w:name="Colorful Shading Accent 4" w:semiHidden="0" w:uiPriority="71" w:unhideWhenUsed="0"/>
+    <w:lsdException w:name="Colorful List Accent 4" w:semiHidden="0" w:uiPriority="72" w:unhideWhenUsed="0"/>
+    <w:lsdException w:name="Colorful Grid Accent 4" w:semiHidden="0" w:uiPriority="73" w:unhideWhenUsed="0"/>
+    <w:lsdException w:name="Light Shading Accent 5" w:semiHidden="0" w:uiPriority="60" w:unhideWhenUsed="0"/>
+    <w:lsdException w:name="Light List Accent 5" w:semiHidden="0" w:uiPriority="61" w:unhideWhenUsed="0"/>
+    <w:lsdException w:name="Light Grid Accent 5" w:semiHidden="0" w:uiPriority="62" w:unhideWhenUsed="0"/>
+    <w:lsdException w:name="Medium Shading 1 Accent 5" w:semiHidden="0" w:uiPriority="63" w:unhideWhenUsed="0"/>
+    <w:lsdException w:name="Medium Shading 2 Accent 5" w:semiHidden="0" w:uiPriority="64" w:unhideWhenUsed="0"/>
+    <w:lsdException w:name="Medium List 1 Accent 5" w:semiHidden="0" w:uiPriority="65" w:unhideWhenUsed="0"/>
+    <w:lsdException w:name="Medium List 2 Accent 5" w:semiHidden="0" w:uiPriority="66" w:unhideWhenUsed="0"/>
+    <w:lsdException w:name="Medium Grid 1 Accent 5" w:semiHidden="0" w:uiPriority="67" w:unhideWhenUsed="0"/>
+    <w:lsdException w:name="Medium Grid 2 Accent 5" w:semiHidden="0" w:uiPriority="68" w:unhideWhenUsed="0"/>
+    <w:lsdException w:name="Medium Grid 3 Accent 5" w:semiHidden="0" w:uiPriority="69" w:unhideWhenUsed="0"/>
+    <w:lsdException w:name="Dark List Accent 5" w:semiHidden="0" w:uiPriority="70" w:unhideWhenUsed="0"/>
+    <w:lsdException w:name="Colorful Shading Accent 5" w:semiHidden="0" w:uiPriority="71" w:unhideWhenUsed="0"/>
+    <w:lsdException w:name="Colorful List Accent 5" w:semiHidden="0" w:uiPriority="72" w:unhideWhenUsed="0"/>
+    <w:lsdException w:name="Colorful Grid Accent 5" w:semiHidden="0" w:uiPriority="73" w:unhideWhenUsed="0"/>
+    <w:lsdException w:name="Light Shading Accent 6" w:semiHidden="0" w:uiPriority="60" w:unhideWhenUsed="0"/>
+    <w:lsdException w:name="Light List Accent 6" w:semiHidden="0" w:uiPriority="61" w:unhideWhenUsed="0"/>
+    <w:lsdException w:name="Light Grid Accent 6" w:semiHidden="0" w:uiPriority="62" w:unhideWhenUsed="0"/>
+    <w:lsdException w:name="Medium Shading 1 Accent 6" w:semiHidden="0" w:uiPriority="63" w:unhideWhenUsed="0"/>
+    <w:lsdException w:name="Medium Shading 2 Accent 6" w:semiHidden="0" w:uiPriority="64" w:unhideWhenUsed="0"/>
+    <w:lsdException w:name="Medium List 1 Accent 6" w:semiHidden="0" w:uiPriority="65" w:unhideWhenUsed="0"/>
+    <w:lsdException w:name="Medium List 2 Accent 6" w:semiHidden="0" w:uiPriority="66" w:unhideWhenUsed="0"/>
+    <w:lsdException w:name="Medium Grid 1 Accent 6" w:semiHidden="0" w:uiPriority="67" w:unhideWhenUsed="0"/>
+    <w:lsdException w:name="Medium Grid 2 Accent 6" w:semiHidden="0" w:uiPriority="68" w:unhideWhenUsed="0"/>
+    <w:lsdException w:name="Medium Grid 3 Accent 6" w:semiHidden="0" w:uiPriority="69" w:unhideWhenUsed="0"/>
+    <w:lsdException w:name="Dark List Accent 6" w:semiHidden="0" w:uiPriority="70" w:unhideWhenUsed="0"/>
+    <w:lsdException w:name="Colorful Shading Accent 6" w:semiHidden="0" w:uiPriority="71" w:unhideWhenUsed="0"/>
+    <w:lsdException w:name="Colorful List Accent 6" w:semiHidden="0" w:uiPriority="72" w:unhideWhenUsed="0"/>
+    <w:lsdException w:name="Colorful Grid Accent 6" w:semiHidden="0" w:uiPriority="73" w:unhideWhenUsed="0"/>
+    <w:lsdException w:name="Subtle Emphasis" w:semiHidden="0" w:uiPriority="19" w:unhideWhenUsed="0" w:qFormat="1"/>
+    <w:lsdException w:name="Intense Emphasis" w:semiHidden="0" w:uiPriority="21" w:unhideWhenUsed="0" w:qFormat="1"/>
+    <w:lsdException w:name="Subtle Reference" w:semiHidden="0" w:uiPriority="31" w:unhideWhenUsed="0" w:qFormat="1"/>
+    <w:lsdException w:name="Intense Reference" w:semiHidden="0" w:uiPriority="32" w:unhideWhenUsed="0" w:qFormat="1"/>
+    <w:lsdException w:name="Book Title" w:semiHidden="0" w:uiPriority="33" w:unhideWhenUsed="0" w:qFormat="1"/>
     <w:lsdException w:name="Bibliography" w:uiPriority="37"/>
     <w:lsdException w:name="TOC Heading" w:uiPriority="39" w:qFormat="1"/>
   </w:latentStyles>
-  <w:style w:type="paragraph" w:styleId="Normal" w:default="1">
+  <w:style w:type="paragraph" w:default="1" w:styleId="Normal">
     <w:name w:val="Normal"/>
     <w:qFormat/>
     <w:pPr>
-      <w:widowControl/>
-      <w:suppressAutoHyphens w:val="true"/>
-      <w:bidi w:val="0"/>
-      <w:spacing w:lineRule="auto" w:line="276" w:before="0" w:after="200"/>
-      <w:jc w:val="left"/>
+      <w:spacing w:after="200" w:line="276" w:lineRule="auto"/>
     </w:pPr>
-    <w:rPr>
-      <w:rFonts w:ascii="Calibri" w:hAnsi="Calibri" w:eastAsia="Calibri" w:cs="" w:asciiTheme="minorHAnsi" w:cstheme="minorBidi" w:eastAsiaTheme="minorHAnsi" w:hAnsiTheme="minorHAnsi"/>
-      <w:color w:val="auto"/>
-      <w:kern w:val="0"/>
-      <w:sz w:val="22"/>
-      <w:szCs w:val="22"/>
-      <w:lang w:val="es-ES" w:eastAsia="en-US" w:bidi="ar-SA"/>
-    </w:rPr>
-  </w:style>
-  <w:style w:type="character" w:styleId="DefaultParagraphFont" w:default="1">
+  </w:style>
+  <w:style w:type="character" w:default="1" w:styleId="Fuentedeprrafopredeter">
     <w:name w:val="Default Paragraph Font"/>
     <w:uiPriority w:val="1"/>
+    <w:semiHidden/>
     <w:unhideWhenUsed/>
-    <w:qFormat/>
-    <w:rPr/>
-  </w:style>
-  <w:style w:type="character" w:styleId="EnlacedeInternet">
+  </w:style>
+  <w:style w:type="table" w:default="1" w:styleId="Tablanormal">
+    <w:name w:val="Normal Table"/>
+    <w:uiPriority w:val="99"/>
+    <w:semiHidden/>
+    <w:unhideWhenUsed/>
+    <w:tblPr>
+      <w:tblInd w:w="0" w:type="dxa"/>
+      <w:tblCellMar>
+        <w:top w:w="0" w:type="dxa"/>
+        <w:left w:w="108" w:type="dxa"/>
+        <w:bottom w:w="0" w:type="dxa"/>
+        <w:right w:w="108" w:type="dxa"/>
+      </w:tblCellMar>
+    </w:tblPr>
+  </w:style>
+  <w:style w:type="numbering" w:default="1" w:styleId="Sinlista">
+    <w:name w:val="No List"/>
+    <w:uiPriority w:val="99"/>
+    <w:semiHidden/>
+    <w:unhideWhenUsed/>
+  </w:style>
+  <w:style w:type="character" w:customStyle="1" w:styleId="EnlacedeInternet">
     <w:name w:val="Enlace de Internet"/>
     <w:rPr>
       <w:color w:val="000080"/>
       <w:u w:val="single"/>
     </w:rPr>
   </w:style>
-  <w:style w:type="character" w:styleId="Textooriginal">
+  <w:style w:type="character" w:customStyle="1" w:styleId="Textooriginal">
     <w:name w:val="Texto original"/>
     <w:qFormat/>
     <w:rPr>
-      <w:rFonts w:ascii="Liberation Mono" w:hAnsi="Liberation Mono" w:eastAsia="Liberation Mono" w:cs="Liberation Mono"/>
+      <w:rFonts w:ascii="Liberation Mono" w:eastAsia="Liberation Mono" w:hAnsi="Liberation Mono" w:cs="Liberation Mono"/>
     </w:rPr>
   </w:style>
-  <w:style w:type="character" w:styleId="Destaquemayor">
+  <w:style w:type="character" w:customStyle="1" w:styleId="Destaquemayor">
     <w:name w:val="Destaque mayor"/>
     <w:qFormat/>
     <w:rPr>
@@ -795,19 +866,18 @@
       <w:bCs/>
     </w:rPr>
   </w:style>
-  <w:style w:type="character" w:styleId="Vietas">
+  <w:style w:type="character" w:customStyle="1" w:styleId="Vietas">
     <w:name w:val="Viñetas"/>
     <w:qFormat/>
     <w:rPr>
-      <w:rFonts w:ascii="OpenSymbol" w:hAnsi="OpenSymbol" w:eastAsia="OpenSymbol" w:cs="OpenSymbol"/>
+      <w:rFonts w:ascii="OpenSymbol" w:eastAsia="OpenSymbol" w:hAnsi="OpenSymbol" w:cs="OpenSymbol"/>
     </w:rPr>
   </w:style>
-  <w:style w:type="character" w:styleId="Smbolosdenumeracin">
+  <w:style w:type="character" w:customStyle="1" w:styleId="Smbolosdenumeracin">
     <w:name w:val="Símbolos de numeración"/>
     <w:qFormat/>
-    <w:rPr/>
-  </w:style>
-  <w:style w:type="character" w:styleId="EnlacedeInternetvisitado">
+  </w:style>
+  <w:style w:type="character" w:customStyle="1" w:styleId="EnlacedeInternetvisitado">
     <w:name w:val="Enlace de Internet visitado"/>
     <w:rPr>
       <w:color w:val="800000"/>
@@ -815,38 +885,36 @@
     </w:rPr>
   </w:style>
   <w:style w:type="paragraph" w:styleId="Ttulo">
-    <w:name w:val="Título"/>
+    <w:name w:val="Title"/>
     <w:basedOn w:val="Normal"/>
-    <w:next w:val="Cuerpodetexto"/>
+    <w:next w:val="Textoindependiente"/>
     <w:qFormat/>
     <w:pPr>
-      <w:keepNext w:val="true"/>
+      <w:keepNext/>
       <w:spacing w:before="240" w:after="120"/>
     </w:pPr>
     <w:rPr>
-      <w:rFonts w:ascii="Liberation Sans" w:hAnsi="Liberation Sans" w:eastAsia="Noto Sans CJK SC" w:cs="Lohit Devanagari"/>
+      <w:rFonts w:ascii="Liberation Sans" w:eastAsia="Noto Sans CJK SC" w:hAnsi="Liberation Sans" w:cs="Lohit Devanagari"/>
       <w:sz w:val="28"/>
       <w:szCs w:val="28"/>
     </w:rPr>
   </w:style>
-  <w:style w:type="paragraph" w:styleId="Cuerpodetexto">
+  <w:style w:type="paragraph" w:styleId="Textoindependiente">
     <w:name w:val="Body Text"/>
     <w:basedOn w:val="Normal"/>
     <w:pPr>
-      <w:spacing w:lineRule="auto" w:line="276" w:before="0" w:after="140"/>
+      <w:spacing w:after="140"/>
     </w:pPr>
-    <w:rPr/>
   </w:style>
   <w:style w:type="paragraph" w:styleId="Lista">
     <w:name w:val="List"/>
-    <w:basedOn w:val="Cuerpodetexto"/>
-    <w:pPr/>
+    <w:basedOn w:val="Textoindependiente"/>
     <w:rPr>
       <w:rFonts w:cs="Lohit Devanagari"/>
     </w:rPr>
   </w:style>
-  <w:style w:type="paragraph" w:styleId="Leyenda">
-    <w:name w:val="Caption"/>
+  <w:style w:type="paragraph" w:styleId="Epgrafe">
+    <w:name w:val="caption"/>
     <w:basedOn w:val="Normal"/>
     <w:qFormat/>
     <w:pPr>
@@ -861,7 +929,7 @@
       <w:szCs w:val="24"/>
     </w:rPr>
   </w:style>
-  <w:style w:type="paragraph" w:styleId="Ndice">
+  <w:style w:type="paragraph" w:customStyle="1" w:styleId="ndice">
     <w:name w:val="Índice"/>
     <w:basedOn w:val="Normal"/>
     <w:qFormat/>
@@ -872,44 +940,199 @@
       <w:rFonts w:cs="Lohit Devanagari"/>
     </w:rPr>
   </w:style>
-  <w:style w:type="paragraph" w:styleId="Cabeceraypie">
+  <w:style w:type="paragraph" w:customStyle="1" w:styleId="Cabeceraypie">
     <w:name w:val="Cabecera y pie"/>
     <w:basedOn w:val="Normal"/>
     <w:qFormat/>
     <w:pPr>
       <w:suppressLineNumbers/>
       <w:tabs>
-        <w:tab w:val="clear" w:pos="708"/>
-        <w:tab w:val="center" w:pos="4252" w:leader="none"/>
-        <w:tab w:val="right" w:pos="8504" w:leader="none"/>
+        <w:tab w:val="center" w:pos="4252"/>
+        <w:tab w:val="right" w:pos="8504"/>
       </w:tabs>
     </w:pPr>
-    <w:rPr/>
-  </w:style>
-  <w:style w:type="paragraph" w:styleId="Cabecera">
-    <w:name w:val="Header"/>
+  </w:style>
+  <w:style w:type="paragraph" w:styleId="Encabezado">
+    <w:name w:val="header"/>
     <w:basedOn w:val="Cabeceraypie"/>
-    <w:pPr>
-      <w:suppressLineNumbers/>
-    </w:pPr>
-    <w:rPr/>
-  </w:style>
-  <w:style w:type="paragraph" w:styleId="Contenidodelatabla">
+  </w:style>
+  <w:style w:type="paragraph" w:customStyle="1" w:styleId="Contenidodelatabla">
     <w:name w:val="Contenido de la tabla"/>
     <w:basedOn w:val="Normal"/>
     <w:qFormat/>
     <w:pPr>
-      <w:widowControl w:val="false"/>
+      <w:widowControl w:val="0"/>
       <w:suppressLineNumbers/>
     </w:pPr>
-    <w:rPr/>
-  </w:style>
-  <w:style w:type="numbering" w:styleId="NoList" w:default="1">
-    <w:name w:val="No List"/>
-    <w:uiPriority w:val="99"/>
+  </w:style>
+</w:styles>
+</file>
+
+<file path=word/stylesWithEffects.xml><?xml version="1.0" encoding="utf-8"?>
+<w:styles xmlns:wpc="http://schemas.microsoft.com/office/word/2010/wordprocessingCanvas" xmlns:mc="http://schemas.openxmlformats.org/markup-compatibility/2006" xmlns:o="urn:schemas-microsoft-com:office:office" xmlns:r="http://schemas.openxmlformats.org/officeDocument/2006/relationships" xmlns:m="http://schemas.openxmlformats.org/officeDocument/2006/math" xmlns:v="urn:schemas-microsoft-com:vml" xmlns:wp14="http://schemas.microsoft.com/office/word/2010/wordprocessingDrawing" xmlns:wp="http://schemas.openxmlformats.org/drawingml/2006/wordprocessingDrawing" xmlns:w10="urn:schemas-microsoft-com:office:word" xmlns:w="http://schemas.openxmlformats.org/wordprocessingml/2006/main" xmlns:w14="http://schemas.microsoft.com/office/word/2010/wordml" xmlns:wpg="http://schemas.microsoft.com/office/word/2010/wordprocessingGroup" xmlns:wpi="http://schemas.microsoft.com/office/word/2010/wordprocessingInk" xmlns:wne="http://schemas.microsoft.com/office/word/2006/wordml" xmlns:wps="http://schemas.microsoft.com/office/word/2010/wordprocessingShape" mc:Ignorable="w14 wp14">
+  <w:docDefaults>
+    <w:rPrDefault>
+      <w:rPr>
+        <w:rFonts w:asciiTheme="minorHAnsi" w:eastAsiaTheme="minorEastAsia" w:hAnsiTheme="minorHAnsi" w:cstheme="minorBidi"/>
+        <w:sz w:val="22"/>
+        <w:szCs w:val="22"/>
+        <w:lang w:val="es-ES" w:eastAsia="es-ES" w:bidi="ar-SA"/>
+      </w:rPr>
+    </w:rPrDefault>
+    <w:pPrDefault>
+      <w:pPr>
+        <w:spacing w:after="200" w:line="276" w:lineRule="auto"/>
+      </w:pPr>
+    </w:pPrDefault>
+  </w:docDefaults>
+  <w:latentStyles w:defLockedState="0" w:defUIPriority="99" w:defSemiHidden="1" w:defUnhideWhenUsed="1" w:defQFormat="0" w:count="267">
+    <w:lsdException w:name="Normal" w:semiHidden="0" w:uiPriority="0" w:unhideWhenUsed="0" w:qFormat="1"/>
+    <w:lsdException w:name="heading 1" w:semiHidden="0" w:uiPriority="9" w:unhideWhenUsed="0" w:qFormat="1"/>
+    <w:lsdException w:name="heading 2" w:uiPriority="9" w:qFormat="1"/>
+    <w:lsdException w:name="heading 3" w:uiPriority="9" w:qFormat="1"/>
+    <w:lsdException w:name="heading 4" w:uiPriority="9" w:qFormat="1"/>
+    <w:lsdException w:name="heading 5" w:uiPriority="9" w:qFormat="1"/>
+    <w:lsdException w:name="heading 6" w:uiPriority="9" w:qFormat="1"/>
+    <w:lsdException w:name="heading 7" w:uiPriority="9" w:qFormat="1"/>
+    <w:lsdException w:name="heading 8" w:uiPriority="9" w:qFormat="1"/>
+    <w:lsdException w:name="heading 9" w:uiPriority="9" w:qFormat="1"/>
+    <w:lsdException w:name="toc 1" w:uiPriority="39"/>
+    <w:lsdException w:name="toc 2" w:uiPriority="39"/>
+    <w:lsdException w:name="toc 3" w:uiPriority="39"/>
+    <w:lsdException w:name="toc 4" w:uiPriority="39"/>
+    <w:lsdException w:name="toc 5" w:uiPriority="39"/>
+    <w:lsdException w:name="toc 6" w:uiPriority="39"/>
+    <w:lsdException w:name="toc 7" w:uiPriority="39"/>
+    <w:lsdException w:name="toc 8" w:uiPriority="39"/>
+    <w:lsdException w:name="toc 9" w:uiPriority="39"/>
+    <w:lsdException w:name="caption" w:uiPriority="35" w:qFormat="1"/>
+    <w:lsdException w:name="Title" w:semiHidden="0" w:uiPriority="10" w:unhideWhenUsed="0" w:qFormat="1"/>
+    <w:lsdException w:name="Default Paragraph Font" w:uiPriority="1"/>
+    <w:lsdException w:name="Subtitle" w:semiHidden="0" w:uiPriority="11" w:unhideWhenUsed="0" w:qFormat="1"/>
+    <w:lsdException w:name="Strong" w:semiHidden="0" w:uiPriority="22" w:unhideWhenUsed="0" w:qFormat="1"/>
+    <w:lsdException w:name="Emphasis" w:semiHidden="0" w:uiPriority="20" w:unhideWhenUsed="0" w:qFormat="1"/>
+    <w:lsdException w:name="Table Grid" w:semiHidden="0" w:uiPriority="59" w:unhideWhenUsed="0"/>
+    <w:lsdException w:name="Placeholder Text" w:unhideWhenUsed="0"/>
+    <w:lsdException w:name="No Spacing" w:semiHidden="0" w:uiPriority="1" w:unhideWhenUsed="0" w:qFormat="1"/>
+    <w:lsdException w:name="Light Shading" w:semiHidden="0" w:uiPriority="60" w:unhideWhenUsed="0"/>
+    <w:lsdException w:name="Light List" w:semiHidden="0" w:uiPriority="61" w:unhideWhenUsed="0"/>
+    <w:lsdException w:name="Light Grid" w:semiHidden="0" w:uiPriority="62" w:unhideWhenUsed="0"/>
+    <w:lsdException w:name="Medium Shading 1" w:semiHidden="0" w:uiPriority="63" w:unhideWhenUsed="0"/>
+    <w:lsdException w:name="Medium Shading 2" w:semiHidden="0" w:uiPriority="64" w:unhideWhenUsed="0"/>
+    <w:lsdException w:name="Medium List 1" w:semiHidden="0" w:uiPriority="65" w:unhideWhenUsed="0"/>
+    <w:lsdException w:name="Medium List 2" w:semiHidden="0" w:uiPriority="66" w:unhideWhenUsed="0"/>
+    <w:lsdException w:name="Medium Grid 1" w:semiHidden="0" w:uiPriority="67" w:unhideWhenUsed="0"/>
+    <w:lsdException w:name="Medium Grid 2" w:semiHidden="0" w:uiPriority="68" w:unhideWhenUsed="0"/>
+    <w:lsdException w:name="Medium Grid 3" w:semiHidden="0" w:uiPriority="69" w:unhideWhenUsed="0"/>
+    <w:lsdException w:name="Dark List" w:semiHidden="0" w:uiPriority="70" w:unhideWhenUsed="0"/>
+    <w:lsdException w:name="Colorful Shading" w:semiHidden="0" w:uiPriority="71" w:unhideWhenUsed="0"/>
+    <w:lsdException w:name="Colorful List" w:semiHidden="0" w:uiPriority="72" w:unhideWhenUsed="0"/>
+    <w:lsdException w:name="Colorful Grid" w:semiHidden="0" w:uiPriority="73" w:unhideWhenUsed="0"/>
+    <w:lsdException w:name="Light Shading Accent 1" w:semiHidden="0" w:uiPriority="60" w:unhideWhenUsed="0"/>
+    <w:lsdException w:name="Light List Accent 1" w:semiHidden="0" w:uiPriority="61" w:unhideWhenUsed="0"/>
+    <w:lsdException w:name="Light Grid Accent 1" w:semiHidden="0" w:uiPriority="62" w:unhideWhenUsed="0"/>
+    <w:lsdException w:name="Medium Shading 1 Accent 1" w:semiHidden="0" w:uiPriority="63" w:unhideWhenUsed="0"/>
+    <w:lsdException w:name="Medium Shading 2 Accent 1" w:semiHidden="0" w:uiPriority="64" w:unhideWhenUsed="0"/>
+    <w:lsdException w:name="Medium List 1 Accent 1" w:semiHidden="0" w:uiPriority="65" w:unhideWhenUsed="0"/>
+    <w:lsdException w:name="Revision" w:unhideWhenUsed="0"/>
+    <w:lsdException w:name="List Paragraph" w:semiHidden="0" w:uiPriority="34" w:unhideWhenUsed="0" w:qFormat="1"/>
+    <w:lsdException w:name="Quote" w:semiHidden="0" w:uiPriority="29" w:unhideWhenUsed="0" w:qFormat="1"/>
+    <w:lsdException w:name="Intense Quote" w:semiHidden="0" w:uiPriority="30" w:unhideWhenUsed="0" w:qFormat="1"/>
+    <w:lsdException w:name="Medium List 2 Accent 1" w:semiHidden="0" w:uiPriority="66" w:unhideWhenUsed="0"/>
+    <w:lsdException w:name="Medium Grid 1 Accent 1" w:semiHidden="0" w:uiPriority="67" w:unhideWhenUsed="0"/>
+    <w:lsdException w:name="Medium Grid 2 Accent 1" w:semiHidden="0" w:uiPriority="68" w:unhideWhenUsed="0"/>
+    <w:lsdException w:name="Medium Grid 3 Accent 1" w:semiHidden="0" w:uiPriority="69" w:unhideWhenUsed="0"/>
+    <w:lsdException w:name="Dark List Accent 1" w:semiHidden="0" w:uiPriority="70" w:unhideWhenUsed="0"/>
+    <w:lsdException w:name="Colorful Shading Accent 1" w:semiHidden="0" w:uiPriority="71" w:unhideWhenUsed="0"/>
+    <w:lsdException w:name="Colorful List Accent 1" w:semiHidden="0" w:uiPriority="72" w:unhideWhenUsed="0"/>
+    <w:lsdException w:name="Colorful Grid Accent 1" w:semiHidden="0" w:uiPriority="73" w:unhideWhenUsed="0"/>
+    <w:lsdException w:name="Light Shading Accent 2" w:semiHidden="0" w:uiPriority="60" w:unhideWhenUsed="0"/>
+    <w:lsdException w:name="Light List Accent 2" w:semiHidden="0" w:uiPriority="61" w:unhideWhenUsed="0"/>
+    <w:lsdException w:name="Light Grid Accent 2" w:semiHidden="0" w:uiPriority="62" w:unhideWhenUsed="0"/>
+    <w:lsdException w:name="Medium Shading 1 Accent 2" w:semiHidden="0" w:uiPriority="63" w:unhideWhenUsed="0"/>
+    <w:lsdException w:name="Medium Shading 2 Accent 2" w:semiHidden="0" w:uiPriority="64" w:unhideWhenUsed="0"/>
+    <w:lsdException w:name="Medium List 1 Accent 2" w:semiHidden="0" w:uiPriority="65" w:unhideWhenUsed="0"/>
+    <w:lsdException w:name="Medium List 2 Accent 2" w:semiHidden="0" w:uiPriority="66" w:unhideWhenUsed="0"/>
+    <w:lsdException w:name="Medium Grid 1 Accent 2" w:semiHidden="0" w:uiPriority="67" w:unhideWhenUsed="0"/>
+    <w:lsdException w:name="Medium Grid 2 Accent 2" w:semiHidden="0" w:uiPriority="68" w:unhideWhenUsed="0"/>
+    <w:lsdException w:name="Medium Grid 3 Accent 2" w:semiHidden="0" w:uiPriority="69" w:unhideWhenUsed="0"/>
+    <w:lsdException w:name="Dark List Accent 2" w:semiHidden="0" w:uiPriority="70" w:unhideWhenUsed="0"/>
+    <w:lsdException w:name="Colorful Shading Accent 2" w:semiHidden="0" w:uiPriority="71" w:unhideWhenUsed="0"/>
+    <w:lsdException w:name="Colorful List Accent 2" w:semiHidden="0" w:uiPriority="72" w:unhideWhenUsed="0"/>
+    <w:lsdException w:name="Colorful Grid Accent 2" w:semiHidden="0" w:uiPriority="73" w:unhideWhenUsed="0"/>
+    <w:lsdException w:name="Light Shading Accent 3" w:semiHidden="0" w:uiPriority="60" w:unhideWhenUsed="0"/>
+    <w:lsdException w:name="Light List Accent 3" w:semiHidden="0" w:uiPriority="61" w:unhideWhenUsed="0"/>
+    <w:lsdException w:name="Light Grid Accent 3" w:semiHidden="0" w:uiPriority="62" w:unhideWhenUsed="0"/>
+    <w:lsdException w:name="Medium Shading 1 Accent 3" w:semiHidden="0" w:uiPriority="63" w:unhideWhenUsed="0"/>
+    <w:lsdException w:name="Medium Shading 2 Accent 3" w:semiHidden="0" w:uiPriority="64" w:unhideWhenUsed="0"/>
+    <w:lsdException w:name="Medium List 1 Accent 3" w:semiHidden="0" w:uiPriority="65" w:unhideWhenUsed="0"/>
+    <w:lsdException w:name="Medium List 2 Accent 3" w:semiHidden="0" w:uiPriority="66" w:unhideWhenUsed="0"/>
+    <w:lsdException w:name="Medium Grid 1 Accent 3" w:semiHidden="0" w:uiPriority="67" w:unhideWhenUsed="0"/>
+    <w:lsdException w:name="Medium Grid 2 Accent 3" w:semiHidden="0" w:uiPriority="68" w:unhideWhenUsed="0"/>
+    <w:lsdException w:name="Medium Grid 3 Accent 3" w:semiHidden="0" w:uiPriority="69" w:unhideWhenUsed="0"/>
+    <w:lsdException w:name="Dark List Accent 3" w:semiHidden="0" w:uiPriority="70" w:unhideWhenUsed="0"/>
+    <w:lsdException w:name="Colorful Shading Accent 3" w:semiHidden="0" w:uiPriority="71" w:unhideWhenUsed="0"/>
+    <w:lsdException w:name="Colorful List Accent 3" w:semiHidden="0" w:uiPriority="72" w:unhideWhenUsed="0"/>
+    <w:lsdException w:name="Colorful Grid Accent 3" w:semiHidden="0" w:uiPriority="73" w:unhideWhenUsed="0"/>
+    <w:lsdException w:name="Light Shading Accent 4" w:semiHidden="0" w:uiPriority="60" w:unhideWhenUsed="0"/>
+    <w:lsdException w:name="Light List Accent 4" w:semiHidden="0" w:uiPriority="61" w:unhideWhenUsed="0"/>
+    <w:lsdException w:name="Light Grid Accent 4" w:semiHidden="0" w:uiPriority="62" w:unhideWhenUsed="0"/>
+    <w:lsdException w:name="Medium Shading 1 Accent 4" w:semiHidden="0" w:uiPriority="63" w:unhideWhenUsed="0"/>
+    <w:lsdException w:name="Medium Shading 2 Accent 4" w:semiHidden="0" w:uiPriority="64" w:unhideWhenUsed="0"/>
+    <w:lsdException w:name="Medium List 1 Accent 4" w:semiHidden="0" w:uiPriority="65" w:unhideWhenUsed="0"/>
+    <w:lsdException w:name="Medium List 2 Accent 4" w:semiHidden="0" w:uiPriority="66" w:unhideWhenUsed="0"/>
+    <w:lsdException w:name="Medium Grid 1 Accent 4" w:semiHidden="0" w:uiPriority="67" w:unhideWhenUsed="0"/>
+    <w:lsdException w:name="Medium Grid 2 Accent 4" w:semiHidden="0" w:uiPriority="68" w:unhideWhenUsed="0"/>
+    <w:lsdException w:name="Medium Grid 3 Accent 4" w:semiHidden="0" w:uiPriority="69" w:unhideWhenUsed="0"/>
+    <w:lsdException w:name="Dark List Accent 4" w:semiHidden="0" w:uiPriority="70" w:unhideWhenUsed="0"/>
+    <w:lsdException w:name="Colorful Shading Accent 4" w:semiHidden="0" w:uiPriority="71" w:unhideWhenUsed="0"/>
+    <w:lsdException w:name="Colorful List Accent 4" w:semiHidden="0" w:uiPriority="72" w:unhideWhenUsed="0"/>
+    <w:lsdException w:name="Colorful Grid Accent 4" w:semiHidden="0" w:uiPriority="73" w:unhideWhenUsed="0"/>
+    <w:lsdException w:name="Light Shading Accent 5" w:semiHidden="0" w:uiPriority="60" w:unhideWhenUsed="0"/>
+    <w:lsdException w:name="Light List Accent 5" w:semiHidden="0" w:uiPriority="61" w:unhideWhenUsed="0"/>
+    <w:lsdException w:name="Light Grid Accent 5" w:semiHidden="0" w:uiPriority="62" w:unhideWhenUsed="0"/>
+    <w:lsdException w:name="Medium Shading 1 Accent 5" w:semiHidden="0" w:uiPriority="63" w:unhideWhenUsed="0"/>
+    <w:lsdException w:name="Medium Shading 2 Accent 5" w:semiHidden="0" w:uiPriority="64" w:unhideWhenUsed="0"/>
+    <w:lsdException w:name="Medium List 1 Accent 5" w:semiHidden="0" w:uiPriority="65" w:unhideWhenUsed="0"/>
+    <w:lsdException w:name="Medium List 2 Accent 5" w:semiHidden="0" w:uiPriority="66" w:unhideWhenUsed="0"/>
+    <w:lsdException w:name="Medium Grid 1 Accent 5" w:semiHidden="0" w:uiPriority="67" w:unhideWhenUsed="0"/>
+    <w:lsdException w:name="Medium Grid 2 Accent 5" w:semiHidden="0" w:uiPriority="68" w:unhideWhenUsed="0"/>
+    <w:lsdException w:name="Medium Grid 3 Accent 5" w:semiHidden="0" w:uiPriority="69" w:unhideWhenUsed="0"/>
+    <w:lsdException w:name="Dark List Accent 5" w:semiHidden="0" w:uiPriority="70" w:unhideWhenUsed="0"/>
+    <w:lsdException w:name="Colorful Shading Accent 5" w:semiHidden="0" w:uiPriority="71" w:unhideWhenUsed="0"/>
+    <w:lsdException w:name="Colorful List Accent 5" w:semiHidden="0" w:uiPriority="72" w:unhideWhenUsed="0"/>
+    <w:lsdException w:name="Colorful Grid Accent 5" w:semiHidden="0" w:uiPriority="73" w:unhideWhenUsed="0"/>
+    <w:lsdException w:name="Light Shading Accent 6" w:semiHidden="0" w:uiPriority="60" w:unhideWhenUsed="0"/>
+    <w:lsdException w:name="Light List Accent 6" w:semiHidden="0" w:uiPriority="61" w:unhideWhenUsed="0"/>
+    <w:lsdException w:name="Light Grid Accent 6" w:semiHidden="0" w:uiPriority="62" w:unhideWhenUsed="0"/>
+    <w:lsdException w:name="Medium Shading 1 Accent 6" w:semiHidden="0" w:uiPriority="63" w:unhideWhenUsed="0"/>
+    <w:lsdException w:name="Medium Shading 2 Accent 6" w:semiHidden="0" w:uiPriority="64" w:unhideWhenUsed="0"/>
+    <w:lsdException w:name="Medium List 1 Accent 6" w:semiHidden="0" w:uiPriority="65" w:unhideWhenUsed="0"/>
+    <w:lsdException w:name="Medium List 2 Accent 6" w:semiHidden="0" w:uiPriority="66" w:unhideWhenUsed="0"/>
+    <w:lsdException w:name="Medium Grid 1 Accent 6" w:semiHidden="0" w:uiPriority="67" w:unhideWhenUsed="0"/>
+    <w:lsdException w:name="Medium Grid 2 Accent 6" w:semiHidden="0" w:uiPriority="68" w:unhideWhenUsed="0"/>
+    <w:lsdException w:name="Medium Grid 3 Accent 6" w:semiHidden="0" w:uiPriority="69" w:unhideWhenUsed="0"/>
+    <w:lsdException w:name="Dark List Accent 6" w:semiHidden="0" w:uiPriority="70" w:unhideWhenUsed="0"/>
+    <w:lsdException w:name="Colorful Shading Accent 6" w:semiHidden="0" w:uiPriority="71" w:unhideWhenUsed="0"/>
+    <w:lsdException w:name="Colorful List Accent 6" w:semiHidden="0" w:uiPriority="72" w:unhideWhenUsed="0"/>
+    <w:lsdException w:name="Colorful Grid Accent 6" w:semiHidden="0" w:uiPriority="73" w:unhideWhenUsed="0"/>
+    <w:lsdException w:name="Subtle Emphasis" w:semiHidden="0" w:uiPriority="19" w:unhideWhenUsed="0" w:qFormat="1"/>
+    <w:lsdException w:name="Intense Emphasis" w:semiHidden="0" w:uiPriority="21" w:unhideWhenUsed="0" w:qFormat="1"/>
+    <w:lsdException w:name="Subtle Reference" w:semiHidden="0" w:uiPriority="31" w:unhideWhenUsed="0" w:qFormat="1"/>
+    <w:lsdException w:name="Intense Reference" w:semiHidden="0" w:uiPriority="32" w:unhideWhenUsed="0" w:qFormat="1"/>
+    <w:lsdException w:name="Book Title" w:semiHidden="0" w:uiPriority="33" w:unhideWhenUsed="0" w:qFormat="1"/>
+    <w:lsdException w:name="Bibliography" w:uiPriority="37"/>
+    <w:lsdException w:name="TOC Heading" w:uiPriority="39" w:qFormat="1"/>
+  </w:latentStyles>
+  <w:style w:type="paragraph" w:default="1" w:styleId="Normal">
+    <w:name w:val="Normal"/>
+    <w:qFormat/>
+  </w:style>
+  <w:style w:type="character" w:default="1" w:styleId="Fuentedeprrafopredeter">
+    <w:name w:val="Default Paragraph Font"/>
+    <w:uiPriority w:val="1"/>
     <w:semiHidden/>
     <w:unhideWhenUsed/>
-    <w:qFormat/>
   </w:style>
   <w:style w:type="table" w:default="1" w:styleId="Tablanormal">
     <w:name w:val="Normal Table"/>
@@ -917,6 +1140,7 @@
     <w:semiHidden/>
     <w:unhideWhenUsed/>
     <w:tblPr>
+      <w:tblInd w:w="0" w:type="dxa"/>
       <w:tblCellMar>
         <w:top w:w="0" w:type="dxa"/>
         <w:left w:w="108" w:type="dxa"/>
@@ -924,6 +1148,12 @@
         <w:right w:w="108" w:type="dxa"/>
       </w:tblCellMar>
     </w:tblPr>
+  </w:style>
+  <w:style w:type="numbering" w:default="1" w:styleId="Sinlista">
+    <w:name w:val="No List"/>
+    <w:uiPriority w:val="99"/>
+    <w:semiHidden/>
+    <w:unhideWhenUsed/>
   </w:style>
 </w:styles>
 </file>

</xml_diff>